<commit_message>
Update clock and Z80 journals with 19 September bench evidence
Preserve historical measurements and images; record debounce, RUN regression, selector checks and NMOS low-frequency findings. Qualify manual-step assumptions and document outstanding schematic discrepancies. New annotated analyser figure remains pending source image. Word files only.
</commit_message>
<xml_diff>
--- a/docs/architecture/Athena_Z80_CPU_Bringup_Progress_Record.docx
+++ b/docs/architecture/Athena_Z80_CPU_Bringup_Progress_Record.docx
@@ -58,6 +58,9 @@
       </w:pPr>
       <w:r>
         <w:t>Prepared from the bench work completed to 18 September 2026</w:t>
+      </w:r>
+      <w:r>
+        <w:t xml:space="preserve">. Updated through 19 September 2026; earlier evidence remains dated to its original configuration.</w:t>
       </w:r>
     </w:p>
     <w:p/>
@@ -207,6 +210,9 @@
       </w:pPr>
       <w:r>
         <w:t>The Athena clock also provides a second observability mode: selecting MANUAL and pressing STEP advances the Z80 by one T-state per pulse, allowing individual machine-cycle states to be examined deliberately.</w:t>
+      </w:r>
+      <w:r>
+        <w:t xml:space="preserve"> Qualification, 19 September 2026: clean single-clock generation is now verified after debounce; reliable NMOS CPU state retention during hand-stepping pauses is not established. See section 16.</w:t>
       </w:r>
     </w:p>
     <w:p>
@@ -1460,6 +1466,9 @@
       <w:r>
         <w:t>The Athena clock module is based on an NE556 dual timer, SN7400 NAND logic and an SN74LS157 multiplexer. The final CPU clock is produced at SN7400 pin 11 and is connected to Z80 pin 6.</w:t>
       </w:r>
+      <w:r>
+        <w:t xml:space="preserve"> Update, 19 September 2026: CD40106BE RC/Schmitt conditioning now precedes NE556 pin 8; the final selector and HLT path remain as described.</w:t>
+      </w:r>
     </w:p>
     <w:p>
       <w:pPr>
@@ -1775,6 +1784,9 @@
                 <w:sz w:val="17"/>
               </w:rPr>
               <w:t>Current bring-up operating region</w:t>
+            </w:r>
+            <w:r>
+              <w:t xml:space="preserve"> Historical 18 September measurement; the 19 September independent counter reading is approximately 270.407 kHz.</w:t>
             </w:r>
           </w:p>
         </w:tc>
@@ -4229,10 +4241,16 @@
       <w:r>
         <w:t>The clock module's MANUAL mode provides a controlled way to stop treating the processor as a continuously running device. In MANUAL mode, each press of the STEP pushbutton generates one monostable CPU_CLK pulse. For the Z80, that advances the processor by one T-state, not by one whole instruction.</w:t>
       </w:r>
+      <w:r>
+        <w:t xml:space="preserve"> Qualification, 19 September 2026: this describes the intended timing model. Earlier direct-switch operation could produce extra clock edges, and a clean pulse alone does not establish valid NMOS execution during long clock phases.</w:t>
+      </w:r>
     </w:p>
     <w:p>
       <w:r>
         <w:t>This allows a machine cycle to be traversed one clock at a time while watching the address, data and control buses. The particularly useful signals are A0-A15, D0-D7, M1̄, MREQ̄, RD̄, WR̄, RFSH̄, IORQ̄ and CLK.</w:t>
+      </w:r>
+      <w:r>
+        <w:t xml:space="preserve"> The suitability of arbitrarily slow stepping for this NMOS specimen is now qualified by the low-frequency experiment in section 16.4.</w:t>
       </w:r>
     </w:p>
     <w:p>
@@ -4248,6 +4266,9 @@
       <w:r>
         <w:t>The clock module has already been verified to deliver one final CPU_CLK pulse for one STEP press in MANUAL mode.</w:t>
       </w:r>
+      <w:r>
+        <w:t xml:space="preserve"> Dated clarification: this is supported by the 19 September post-debounce capture; it must not be applied retrospectively to the earlier direct-switch configuration.</w:t>
+      </w:r>
     </w:p>
     <w:p>
       <w:pPr>
@@ -4261,6 +4282,9 @@
       </w:r>
       <w:r>
         <w:t>Because the Z80 state machine advances on clock transitions, each manual pulse advances one T-state. This enables direct comparison of observed external signals with the Z80 timing diagrams.</w:t>
+      </w:r>
+      <w:r>
+        <w:t xml:space="preserve"> Superseded assumption: the inference requires the CPU to retain valid internal state throughout the clock phases. The very-low-frequency experiment shows that this cannot be assumed for the present NMOS device.</w:t>
       </w:r>
     </w:p>
     <w:p>
@@ -4361,6 +4385,9 @@
     <w:p>
       <w:r>
         <w:t>A timing diagram no longer has to be treated only as a drawing in a databook. The STEP clock makes each T-state experimentally accessible: predict the state of the buses and control outputs, press STEP once, measure, and compare the result with the documented timing model.</w:t>
+      </w:r>
+      <w:r>
+        <w:t xml:space="preserve"> Qualification, 19 September 2026: this remains an investigation technique, not proof that this NMOS Z80 can retain valid state for arbitrary manual pauses.</w:t>
       </w:r>
     </w:p>
     <w:p>
@@ -4626,6 +4653,9 @@
                 <w:sz w:val="17"/>
               </w:rPr>
               <w:t>~288 kHz clock reaches Z80 pin 6 with pull-up-assisted HIGH level.</w:t>
+            </w:r>
+            <w:r>
+              <w:t xml:space="preserve"> Historical baseline; approximately 270.407 kHz was independently measured on 19 September after the rebuild.</w:t>
             </w:r>
           </w:p>
         </w:tc>
@@ -5132,6 +5162,9 @@
               </w:rPr>
               <w:t>Available</w:t>
             </w:r>
+            <w:r>
+              <w:t xml:space="preserve"> — clock pulses verified; CPU timing limitation applies</w:t>
+            </w:r>
           </w:p>
         </w:tc>
         <w:tc>
@@ -5144,6 +5177,9 @@
                 <w:sz w:val="17"/>
               </w:rPr>
               <w:t>MANUAL/STEP provides one CPU_CLK pulse per press, permitting one-T-state-at-a-time Z80 observation.</w:t>
+            </w:r>
+            <w:r>
+              <w:t xml:space="preserve"> Qualification, 19 September 2026: clean pulse generation is verified, but reliable one-T-state CPU advancement at hand-stepping rates is not established.</w:t>
             </w:r>
           </w:p>
         </w:tc>
@@ -5164,6 +5200,9 @@
       </w:pPr>
       <w:r>
         <w:t>1.  Use the MANUAL/STEP clock to walk through a forced-NOP M1 cycle one T-state at a time and correlate A0-A15, D0-D7, M1̄, MREQ̄, RD̄, RFSH̄ and CLK with the Z80 timing diagram.</w:t>
+      </w:r>
+      <w:r>
+        <w:t xml:space="preserve"> Revised prerequisite, 19 September 2026: establish suitable clock-phase limits before interpreting slow manual pulses as valid CPU T-state advances.</w:t>
       </w:r>
     </w:p>
     <w:p>
@@ -5217,6 +5256,316 @@
     <w:p>
       <w:r>
         <w:br w:type="page"/>
+      </w:r>
+    </w:p>
+    <w:p>
+      <w:pPr>
+        <w:pStyle w:val="Heading1"/>
+      </w:pPr>
+      <w:r>
+        <w:t xml:space="preserve">16. Bench verification and learning — 19 September 2026</w:t>
+      </w:r>
+    </w:p>
+    <w:p>
+      <w:r>
+        <w:t xml:space="preserve">The forced-NOP RUN baseline remained intact after clock-module rebuilding and STEP conditioning. Clean single-clock generation was verified. A separate very-low-frequency comparison showed loss of coherent NMOS Z80 bus behaviour and recovery when the clock rate was raised. These results distinguish clock integrity from the processor’s ability to retain valid internal state.</w:t>
+      </w:r>
+    </w:p>
+    <w:p>
+      <w:r>
+        <w:t xml:space="preserve">Chronological source: the 19 September bench discussion in Athena: Chat: Main Project, the successor to Athena: Closed: Chat Companion: Learning and Bench Work. The latter ended before this session. Repository cross-check: main ffd4e58. Earlier entries and Figure 1 are retained as historical evidence; dated qualifications identify superseded assumptions explicitly.</w:t>
+      </w:r>
+    </w:p>
+    <w:p>
+      <w:pPr>
+        <w:pStyle w:val="Heading2"/>
+      </w:pPr>
+      <w:r>
+        <w:t xml:space="preserve">16.1 Post-rebuild RUN-mode regression</w:t>
+      </w:r>
+    </w:p>
+    <w:p>
+      <w:r>
+        <w:t xml:space="preserve">The baseline was rechecked after substantial clock rebuilding, STEP-switch diagnosis, addition of the CD40106BE debounce stage and repeated movement of temporary test leads. The established forced-NOP configuration remained: each data line was held LOW through a 1 kΩ pulldown so memory reads present 00h NOP. RUN was selected and CLK was observed at Z80 pin 6.</w:t>
+      </w:r>
+    </w:p>
+    <w:p>
+      <w:r>
+        <w:t xml:space="preserve">DSLogic Plus mapping remained unchanged: D0 = A0, pin 30; D1 = A1, pin 31; D2 = A2, pin 32; D3 = A3, pin 33; D4 = A4, pin 34; D5 = A5, pin 35; D6 = A6, pin 36; D7 = A7, pin 37; D8 = M1̄, pin 27; D9 = MREQ̄, pin 19; D10 = RD̄, pin 21; D11 = CLK, pin 6. The existing mapping tables remain applicable.</w:t>
+      </w:r>
+    </w:p>
+    <w:p>
+      <w:pPr>
+        <w:pStyle w:val="EvidenceNote"/>
+      </w:pPr>
+      <w:r>
+        <w:t xml:space="preserve">Observed fact: The Long Wei TFC-2700L frequency counter measured approximately 270.407 kHz at Z80 pin 6, with the counter reference connected to common Athena ground. This is an independent final-clock measurement, not a minimum-frequency test.</w:t>
+      </w:r>
+    </w:p>
+    <w:p>
+      <w:pPr>
+        <w:pStyle w:val="EvidenceNote"/>
+      </w:pPr>
+      <w:r>
+        <w:t xml:space="preserve">Observed fact: At the higher operating speed A0–A7 behaved as independent address lines. A0 changed fastest, with progressively less frequent changes on each higher bit. The low byte showed the expected binary hierarchy. M1̄, MREQ̄ and RD̄ were active and regular.</w:t>
+      </w:r>
+    </w:p>
+    <w:p>
+      <w:r>
+        <w:t xml:space="preserve">The first post-rebuild capture analysis established coherent control-cycle activity but did not establish a clean sequential address reconstruction. The later healthy higher-frequency comparison established the address hierarchy. These are successive pieces of evidence; the later result is not retroactively attributed to the earlier capture.</w:t>
+      </w:r>
+    </w:p>
+    <w:p>
+      <w:pPr>
+        <w:pStyle w:val="EvidenceNote"/>
+      </w:pPr>
+      <w:r>
+        <w:t xml:space="preserve">Deduction: The pattern is consistent with continued forced-NOP execution. The RUN-mode execution baseline remained intact after the clock and STEP-debounce work.</w:t>
+      </w:r>
+    </w:p>
+    <w:p>
+      <w:r>
+        <w:t xml:space="preserve">Section 4.2 records the earlier change to a 470 pF astable timing capacitor and approximately 286–289 kHz operation. Those historical measurements are preserved alongside the later 270.407 kHz counter result; they are not substituted for one another.</w:t>
+      </w:r>
+    </w:p>
+    <w:p>
+      <w:pPr>
+        <w:pStyle w:val="Heading2"/>
+      </w:pPr>
+      <w:r>
+        <w:t xml:space="preserve">16.2 Manual STEP capability and its limits</w:t>
+      </w:r>
+    </w:p>
+    <w:p>
+      <w:r>
+        <w:t xml:space="preserve">For the complete fault history, component alternatives, wiring and scope evidence, see Athena Clock Module — Learning and Verification Journal.docx, dated 19 September entry. Before conditioning, one mechanical STEP action could produce multiple unintended CPU-clock transitions. One press therefore could not safely be interpreted as one Z80 T-state.</w:t>
+      </w:r>
+    </w:p>
+    <w:p>
+      <w:pPr>
+        <w:pStyle w:val="EvidenceNote"/>
+      </w:pPr>
+      <w:r>
+        <w:t xml:space="preserve">Observed fact: After CD40106BE conditioning, the retained DSLogic analysis reported nine complete clock pulses without extra transitions, one clean pulse per deliberate STEP action. This establishes the clock-side improvement in the tested capture.</w:t>
+      </w:r>
+    </w:p>
+    <w:p>
+      <w:pPr>
+        <w:pStyle w:val="EvidenceNote"/>
+      </w:pPr>
+      <w:r>
+        <w:t xml:space="preserve">Milestone: Reliable manual single-clock stepping available for Z80 T-state investigation — 19 September 2026</w:t>
+      </w:r>
+    </w:p>
+    <w:p>
+      <w:r>
+        <w:t xml:space="preserve">Controlled single-clock investigation is now usable to examine the clock path and CPU response. The milestone describes clean stimulus generation. It does not establish reliable instruction execution through arbitrarily long pauses: the present NMOS specimen lost coherent bus behaviour at very low frequency. A pulse corresponds to one valid T-state only when the CPU’s electrical and clock-phase requirements are met. The earlier unqualified manual-stepping descriptions are superseded by this distinction.</w:t>
+      </w:r>
+    </w:p>
+    <w:p>
+      <w:pPr>
+        <w:pStyle w:val="Heading2"/>
+      </w:pPr>
+      <w:r>
+        <w:t xml:space="preserve">16.3 RUN/MANUAL source-selection verification</w:t>
+      </w:r>
+    </w:p>
+    <w:p>
+      <w:pPr>
+        <w:pStyle w:val="EvidenceNote"/>
+      </w:pPr>
+      <w:r>
+        <w:t xml:space="preserve">Observed fact: SN74LS157 pin 1 measured 0 V in MANUAL and approximately 3.6 V in RUN. With RUN selected, pressing STEP caused no STEP-correlated change at SN74LS157 pin 4 (1Y), SN7400 pin 9 (3A), or SN7400 pin 11 (4Y), the final CPU-clock output.</w:t>
+      </w:r>
+    </w:p>
+    <w:p>
+      <w:pPr>
+        <w:pStyle w:val="EvidenceNote"/>
+      </w:pPr>
+      <w:r>
+        <w:t xml:space="preserve">Deduction: Current evidence supports correct rejection of the manual source while RUN is selected.</w:t>
+      </w:r>
+    </w:p>
+    <w:p>
+      <w:r>
+        <w:t xml:space="preserve">An earlier apparent STEP-through-RUN event was investigated directly at each stage. It could not be reproduced after temporary wiring and probe arrangements were stabilised and was recorded as a transient debugging/probing artefact. The precise disturbed connection was not isolated. This historical observation remains separate from the revised low-frequency analyser-fault hypothesis below.</w:t>
+      </w:r>
+    </w:p>
+    <w:p>
+      <w:pPr>
+        <w:pStyle w:val="Heading2"/>
+      </w:pPr>
+      <w:r>
+        <w:t xml:space="preserve">16.4 NMOS Z80 low-frequency clock behaviour — 19 September 2026</w:t>
+      </w:r>
+    </w:p>
+    <w:p>
+      <w:r>
+        <w:t xml:space="preserve">Purpose: observe directly what happens to the 1986 NMOS Z80A when its external clock is slowed far below the region in which normal operation had been observed, rather than relying solely on a databook statement.</w:t>
+      </w:r>
+    </w:p>
+    <w:p>
+      <w:pPr>
+        <w:pStyle w:val="Heading3"/>
+      </w:pPr>
+      <w:r>
+        <w:t xml:space="preserve">Observed fact</w:t>
+      </w:r>
+    </w:p>
+    <w:p>
+      <w:r>
+        <w:t xml:space="preserve">At the higher clock rate, the address bus showed coherent binary progression, A0 changed fastest and successively higher bits changed less frequently. M1̄, MREQ̄ and RD̄ showed regular activity, consistent with forced-NOP execution.</w:t>
+      </w:r>
+    </w:p>
+    <w:p>
+      <w:r>
+        <w:t xml:space="preserve">At the very low clock rate, A0–A7 ceased to show coherent binary progression and several address lines moved together. M1̄ remained inactive/HIGH during the captured interval. MREQ̄ and RD̄ no longer resembled the normal forced-NOP machine-cycle pattern. An external clock waveform was still electrically present, but valid-looking execution was lost. Increasing the clock rate again restored coherent address progression and regular control activity.</w:t>
+      </w:r>
+    </w:p>
+    <w:p>
+      <w:r>
+        <w:t xml:space="preserve">The same physical system therefore showed coherent forced-NOP bus behaviour at the higher rate and lost that coherence at a very low rate. The conversation estimated roughly 2.4 Hz from the slow capture; that estimate is not an independently established failure threshold.</w:t>
+      </w:r>
+    </w:p>
+    <w:p>
+      <w:pPr>
+        <w:pStyle w:val="Heading3"/>
+      </w:pPr>
+      <w:r>
+        <w:t xml:space="preserve">Diagnostic interpretation reversal</w:t>
+      </w:r>
+    </w:p>
+    <w:p>
+      <w:r>
+        <w:t xml:space="preserve">The first interpretation was a possible DSLogic/probe/ground connection problem because many address channels moved together. The healthy comparison initially appeared to support a temporary probing fault. The user then identified clock frequency as the material difference. The analyser-fault hypothesis was revised in favour of a frequency-dependent CPU explanation. This was a normal diagnostic hypothesis superseded by stronger comparative evidence.</w:t>
+      </w:r>
+    </w:p>
+    <w:p>
+      <w:pPr>
+        <w:pStyle w:val="Heading3"/>
+      </w:pPr>
+      <w:r>
+        <w:t xml:space="preserve">Deduction</w:t>
+      </w:r>
+    </w:p>
+    <w:p>
+      <w:r>
+        <w:t xml:space="preserve">Clock frequency is the material experimental variable separating the captures. The result is consistent with the dynamic internal behaviour of early NMOS Z80 devices: excessively long clock phases can allow internal state to decay even though an external waveform is still present. The captures show the external consequences; they do not directly measure internal stored charge.</w:t>
+      </w:r>
+    </w:p>
+    <w:p>
+      <w:pPr>
+        <w:pStyle w:val="Heading3"/>
+      </w:pPr>
+      <w:r>
+        <w:t xml:space="preserve">Not yet established</w:t>
+      </w:r>
+    </w:p>
+    <w:p>
+      <w:r>
+        <w:t xml:space="preserve">The exact minimum reliable clock frequency of this individual Z80A specimen has not been determined. Neither a precise failure threshold nor guaranteed hand-stepping operation is established. Clock presence alone does not prove compliance with timing requirements.</w:t>
+      </w:r>
+    </w:p>
+    <w:p>
+      <w:pPr>
+        <w:pStyle w:val="Heading3"/>
+      </w:pPr>
+      <w:r>
+        <w:t xml:space="preserve">Future controlled minimum-frequency experiment</w:t>
+      </w:r>
+    </w:p>
+    <w:p>
+      <w:r>
+        <w:t xml:space="preserve">1. Start from a verified normal operating frequency.</w:t>
+      </w:r>
+    </w:p>
+    <w:p>
+      <w:r>
+        <w:t xml:space="preserve">2. Reduce frequency in controlled measured steps.</w:t>
+      </w:r>
+    </w:p>
+    <w:p>
+      <w:r>
+        <w:t xml:space="preserve">3. Record the final CPU clock frequency at every step.</w:t>
+      </w:r>
+    </w:p>
+    <w:p>
+      <w:r>
+        <w:t xml:space="preserve">4. Record HIGH and LOW phase widths where practical.</w:t>
+      </w:r>
+    </w:p>
+    <w:p>
+      <w:r>
+        <w:t xml:space="preserve">5. Use the same DSLogic acceptance criteria at every step: coherent address hierarchy and regular forced-NOP control-cycle behaviour.</w:t>
+      </w:r>
+    </w:p>
+    <w:p>
+      <w:r>
+        <w:t xml:space="preserve">6. Identify the highest frequency at which failure first appears.</w:t>
+      </w:r>
+    </w:p>
+    <w:p>
+      <w:r>
+        <w:t xml:space="preserve">7. Identify the lowest frequency at which correct operation is reproducible.</w:t>
+      </w:r>
+    </w:p>
+    <w:p>
+      <w:r>
+        <w:t xml:space="preserve">8. Repeat measurements around the boundary to distinguish a stable operating limit from a one-off failure.</w:t>
+      </w:r>
+    </w:p>
+    <w:p>
+      <w:pPr>
+        <w:pStyle w:val="Heading2"/>
+      </w:pPr>
+      <w:r>
+        <w:t xml:space="preserve">16.5 DSView acquisition notes</w:t>
+      </w:r>
+    </w:p>
+    <w:p>
+      <w:r>
+        <w:t xml:space="preserve">These operating notes concern DSView 1.3.2 and are separate from the electrical conclusions. Stream mode was useful for live viewing, but detail moved off screen rapidly; the user reported that Parallel decoder output became useful after stopping.</w:t>
+      </w:r>
+    </w:p>
+    <w:p>
+      <w:r>
+        <w:t xml:space="preserve">The retained manual-step workflow used Buffer Mode, Single, 1 MHz and a 10.00 s acquisition setting. The earlier apparent “Single stops instantly” problem was traced to the acquisition duration still being 100 ms. Acquisition length must be checked before treating an immediate stop as a trigger or hardware fault. The 1 MHz manual-step setting must not be confused with the 20 MHz acquisition used for detailed normal-speed timing observations.</w:t>
+      </w:r>
+    </w:p>
+    <w:p>
+      <w:pPr>
+        <w:pStyle w:val="Heading2"/>
+      </w:pPr>
+      <w:r>
+        <w:t xml:space="preserve">16.6 Engineering-record consistency</w:t>
+      </w:r>
+    </w:p>
+    <w:p>
+      <w:r>
+        <w:t xml:space="preserve">The 19 September RUN regression and NMOS low-frequency Markdown records agree with the principal observations and the unmeasured-threshold limitation. The low-frequency record’s phrase “valid clock signal” means electrically present here; CPU timing compliance was not established at the failed slow rate.</w:t>
+      </w:r>
+    </w:p>
+    <w:p>
+      <w:r>
+        <w:t xml:space="preserve">The clock wiring, architecture, fault and milestone records agree with the CD40106BE conditioning and selection checks. Remaining discrepancies are recorded in the clock journal: some Markdown status text still leaves NE556 pins 13/14 outstanding despite their existing Word evidence; the pin-8 pressed-state explanation retains direct-switch wording; astable wiring still lists the historical 1 µF rather than the 470 pF CPU bring-up change.</w:t>
+      </w:r>
+    </w:p>
+    <w:p>
+      <w:r>
+        <w:t xml:space="preserve">At checked commit ffd4e58, the KiCad debounce additions are outside the main Clock.kicad_sch structure and are omitted by a KiCad netlist export. The schematic therefore still requires repair before it can be treated as the as-built construction reference. These discrepancies have not been silently resolved by editing unrelated files.</w:t>
+      </w:r>
+    </w:p>
+    <w:p>
+      <w:pPr>
+        <w:pStyle w:val="Heading2"/>
+      </w:pPr>
+      <w:r>
+        <w:t xml:space="preserve">16.7 Later annotated analyser figure — evidence pending</w:t>
+      </w:r>
+    </w:p>
+    <w:p>
+      <w:r>
+        <w:t xml:space="preserve">The 19 September companion discussion records a new white-background annotated RUN comparison figure, matching the earlier figure’s title hierarchy, channel labels and explanatory panels. Its generated image was not available in the repository or accessible chat attachments during this update. Insertion of that exact figure remains pending; Figure 1 is preserved and has not been reused as later evidence.</w:t>
       </w:r>
     </w:p>
     <w:p>

</xml_diff>